<commit_message>
docs(spps): simplify protection architecture to standard built-in controller protections
</commit_message>
<xml_diff>
--- a/smart_programmable_power_supply/PRODUCT_REQUIREMENT_DOCUMENT_PRD.docx
+++ b/smart_programmable_power_supply/PRODUCT_REQUIREMENT_DOCUMENT_PRD.docx
@@ -8800,10 +8800,10 @@
         <w:t>The Smart Programmable Power Supply is a 4-stage AC-to-DC conversion and regulation system in which the power stage and mixed-signal microcontroller work together to deliver precise, clean, and safe DC power. The module connects directly to universal grid AC mains (85V–265V AC RMS) through an input protection and EMI filter stage, rectifies it to a high-voltage bulk DC rail (+120V to +375V DC), isolates and steps it down via a Quasi-Resonant Flyback stage to an intermediate +24.0V DC bus (72W), and regulates it through a synchronous 4-switch Buck-Boost stage to provide the commanded 5.0V to 20.0V DC output at up to 3.0A.</w:t>
         <w:br/>
         <w:br/>
-        <w:t>The onboard microcontroller (STM32G474) acts as the system brain by reading dual-domain electrical telemetry (primary AC input power and secondary DC load power), computing real-time conversion efficiency, updating the 1.3-inch OLED dashboard, and driving the precision 12-bit DAC voltage steering network. Crucially, high-speed circuit protection (constant-current clamping and over-voltage crowbar) is implemented in autonomous analog hardware with sub-5 microsecond response time, operating completely independent of firmware to guarantee fail-safe protection during load faults or dead short-circuits.</w:t>
+        <w:t>The onboard microcontroller (STM32G474) acts as the system brain by reading dual-domain electrical telemetry (primary AC input power and secondary DC load power), computing real-time conversion efficiency, updating the 1.3-inch OLED dashboard, and driving the precision 12-bit DAC voltage steering network. Circuit protection relies on robust, standard, industry-proven hardware protections: primary AC fuse, inrush NTC, surge MOV, primary cycle-by-cycle Flyback current limiting, and secondary LM5176 built-in cycle-by-cycle overcurrent protection with thermal shutdown.</w:t>
         <w:br/>
         <w:br/>
-        <w:t>In simple terms, the power conversion stages handle the heavy electrical energy flow across certified 3000V RMS galvanic isolation, while the analog protection loops and MCU provide autonomous safety, precision regulation, and live telemetry.</w:t>
+        <w:t>In simple terms, the power conversion stages handle the heavy electrical energy flow across certified 3000V RMS galvanic isolation, while the built-in controller protections and MCU provide safety, precision regulation, and live telemetry.</w:t>
         <w:br/>
         <w:br/>
         <w:t>The primary power supply functionality includes:</w:t>
@@ -8818,13 +8818,13 @@
         <w:br/>
         <w:t>• High-Resolution DAC Voltage Steering: 12-bit DAC network achieves 10mV monotonic setpoint resolution.</w:t>
         <w:br/>
-        <w:t>• Autonomous Sub-5µs Hardware CC Clamping: Analog shunt amplifier and high-speed comparator pull down the regulator COMP pin in &lt; 5µs on overcurrent.</w:t>
+        <w:t>• Built-in Cycle-by-Cycle Hardware Current Limiting: LM5176 monitors output current through a dedicated 10mΩ shunt across its CSP/CSN pins, natively limiting peak inductor current on every switching cycle without external analog complexity.</w:t>
         <w:br/>
-        <w:t>• Hardware Over-Voltage &amp; Over-Temperature Protection: Analog crowbar trips at Vset + 1.5V, and NTC sensor trips shutdown at 90°C.</w:t>
+        <w:t>• Built-in Controller Protections: Integrated input fuse (2A), NTC inrush limiter (10Ω), MOV transient clamp (300V), LM5176 internal thermal shutdown (165°C), and Under-Voltage Lockout (UVLO).</w:t>
         <w:br/>
         <w:t>• Real-Time Dual-Domain Telemetry: Measures AC input power and DC load power, computing live efficiency (η) at 10 Hz.</w:t>
         <w:br/>
-        <w:t>• Interactive Local Dashboard: 1.3" OLED display shows live V, I, P, and efficiency meters; dual rotary encoders allow intuitive tuning; front-panel LEDs indicate CV, CC, and Fault states.</w:t>
+        <w:t>• Interactive Local Dashboard: 1.3" OLED display shows live V, I, P, and efficiency meters; dual rotary encoders allow intuitive tuning; front-panel LEDs indicate CV, Current Limit, and Fault states.</w:t>
         <w:br/>
         <w:t>• Low Standby Power: Consumes &lt; 150 mW in idle state when output is disabled.</w:t>
       </w:r>
@@ -10139,7 +10139,7 @@
                 <w:color w:val="000000"/>
                 <w:sz w:val="17"/>
               </w:rPr>
-              <w:t>Hardware Protection Response</w:t>
+              <w:t>Overcurrent Protection</w:t>
             </w:r>
           </w:p>
         </w:tc>
@@ -10161,7 +10161,7 @@
                 <w:color w:val="000000"/>
                 <w:sz w:val="17"/>
               </w:rPr>
-              <w:t>Autonomous analog CC clamping reaction in &lt; 5.0 µs; Crowbar OVP in &lt; 5.0 µs</w:t>
+              <w:t>LM5176 built-in cycle-by-cycle hardware peak current limit via CSP/CSN</w:t>
             </w:r>
           </w:p>
         </w:tc>
@@ -10303,7 +10303,7 @@
                 <w:color w:val="000000"/>
                 <w:sz w:val="17"/>
               </w:rPr>
-              <w:t>1.3" I2C OLED display, dual rotary encoders, CV/CC/Fault LEDs, tactile Enable switch</w:t>
+              <w:t>1.3" I2C OLED display, dual rotary encoders, Status LEDs, tactile Enable switch</w:t>
             </w:r>
           </w:p>
         </w:tc>
@@ -10389,7 +10389,7 @@
     </w:p>
     <w:p>
       <w:r>
-        <w:t>The product is designed as a unified Embedded Hardware Power Supply Module (System 1). Primary hardware stages include AC Mains Protection &amp; EMI Filter, GBU606 Bridge Rectifier &amp; Bulk Capacitor (+120V to +375V DC), Stage 1 Isolated Quasi-Resonant Flyback Converter (+24V DC, 72W), Stage 2 Synchronous 4-Switch Buck-Boost Post-Regulator (5V–20V / 3A DC), and Analog DAC Steering &amp; Fast Hardware Protection Loops.</w:t>
+        <w:t>The product is designed as a unified Embedded Hardware Power Supply Module (System 1). Primary hardware stages include AC Mains Protection &amp; EMI Filter, GBU606 Bridge Rectifier &amp; Bulk Capacitor (+120V to +375V DC), Stage 1 Isolated Quasi-Resonant Flyback Converter (+24V DC, 72W), Stage 2 Synchronous 4-Switch Buck-Boost Post-Regulator (5V–20V / 3A DC), and Analog DAC Steering &amp; Built-in Hardware Protections.</w:t>
       </w:r>
     </w:p>
     <w:p>
@@ -10409,11 +10409,11 @@
       <w:r>
         <w:t>The primary power supply functionality includes four operating modes:</w:t>
         <w:br/>
-        <w:t>• Constant Voltage (CV) Mode: Regulates output voltage within ±0.2% across varying load currents below Iset.</w:t>
+        <w:t>• Constant Voltage (CV) Mode: Regulates output voltage within ±0.2% across varying load currents below the current limit.</w:t>
         <w:br/>
-        <w:t>• Constant Current (CC) Mode: Autonomously clamps output current at Iset within &lt; 5µs during overload or short-circuit.</w:t>
+        <w:t>• Current-Limited (OCP) Mode: Restricts peak inductor current cycle-by-cycle via LM5176 CSP/CSN sense during overload or short-circuit.</w:t>
         <w:br/>
-        <w:t>• Hardware Fault Protection Mode: Immediately shuts down switching on over-voltage (Vset + 1.5V) or over-temperature (90°C).</w:t>
+        <w:t>• MCU Supervisory Protection Mode: Safely disables switching via LM5176 ENABLE pin on persistent overload or over-temperature.</w:t>
         <w:br/>
         <w:t>• Standby / Idle Mode: Output power stage disabled while +24V intermediate rail is maintained with standby power &lt; 150mW.</w:t>
       </w:r>
@@ -10793,7 +10793,7 @@
                 <w:color w:val="000000"/>
                 <w:sz w:val="18"/>
               </w:rPr>
-              <w:t>Autonomous sub-5 µs analog hardware Constant-Current (CC) clamping</w:t>
+              <w:t>LM5176 built-in cycle-by-cycle overcurrent protection via CSP/CSN pins</w:t>
             </w:r>
           </w:p>
         </w:tc>
@@ -10842,7 +10842,7 @@
                 <w:color w:val="000000"/>
                 <w:sz w:val="18"/>
               </w:rPr>
-              <w:t>Fast analog Over-Voltage Protection (OVP) crowbar disconnect (&lt; 5 µs)</w:t>
+              <w:t>Primary Flyback cycle-by-cycle current limit via UCC28740 CS resistor</w:t>
             </w:r>
           </w:p>
         </w:tc>
@@ -10891,7 +10891,7 @@
                 <w:color w:val="000000"/>
                 <w:sz w:val="18"/>
               </w:rPr>
-              <w:t>Thermal monitoring and automatic Over-Temperature Protection (OTP at 90°C)</w:t>
+              <w:t>Controller internal thermal shutdown and board temperature monitoring</w:t>
             </w:r>
           </w:p>
         </w:tc>
@@ -11087,7 +11087,7 @@
                 <w:color w:val="000000"/>
                 <w:sz w:val="18"/>
               </w:rPr>
-              <w:t>Local front-panel rotary encoder tuning, tactile output enable, and mode LED indication</w:t>
+              <w:t>Local front-panel rotary encoder tuning, tactile output enable, and status LED indication</w:t>
             </w:r>
           </w:p>
         </w:tc>
@@ -12022,7 +12022,7 @@
                 <w:color w:val="000000"/>
                 <w:sz w:val="18"/>
               </w:rPr>
-              <w:t>Quadrature rotary controls for setting voltage (10mV) and current limit (10mA)</w:t>
+              <w:t>Quadrature rotary controls for setting voltage (10mV resolution)</w:t>
             </w:r>
           </w:p>
         </w:tc>
@@ -12427,7 +12427,7 @@
                 <w:color w:val="000000"/>
                 <w:sz w:val="18"/>
               </w:rPr>
-              <w:t>Visual indication of CV (Green), CC (Amber), and System Fault (Red) states</w:t>
+              <w:t>Visual indication of Output Active (Green), Limit (Amber), and Fault (Red) states</w:t>
             </w:r>
           </w:p>
         </w:tc>
@@ -12657,7 +12657,7 @@
                 <w:color w:val="000000"/>
                 <w:sz w:val="18"/>
               </w:rPr>
-              <w:t>Diagnostic test loops for measuring switching waveforms, ripple, and noise</w:t>
+              <w:t>Diagnostic test loops for measuring intermediate rail, ripple, and noise</w:t>
             </w:r>
           </w:p>
         </w:tc>
@@ -13811,7 +13811,7 @@
                 <w:color w:val="000000"/>
                 <w:sz w:val="18"/>
               </w:rPr>
-              <w:t>TLV3501 Comparator</w:t>
+              <w:t>Rotary Encoders</w:t>
             </w:r>
           </w:p>
         </w:tc>
@@ -13833,7 +13833,7 @@
                 <w:color w:val="000000"/>
                 <w:sz w:val="18"/>
               </w:rPr>
-              <w:t>Current Limit Ref</w:t>
+              <w:t>User Input</w:t>
             </w:r>
           </w:p>
         </w:tc>
@@ -13855,7 +13855,7 @@
                 <w:color w:val="000000"/>
                 <w:sz w:val="18"/>
               </w:rPr>
-              <w:t>Internal 12-Bit DAC</w:t>
+              <w:t>Timer Encoder Interface</w:t>
             </w:r>
           </w:p>
         </w:tc>
@@ -13877,7 +13877,7 @@
                 <w:color w:val="000000"/>
                 <w:sz w:val="18"/>
               </w:rPr>
-              <w:t>Sets analog reference voltage for autonomous hardware CC comparator</w:t>
+              <w:t>Hardware quadrature decoding of rotary dials with debounced push-switches</w:t>
             </w:r>
           </w:p>
         </w:tc>
@@ -13948,7 +13948,7 @@
                 <w:color w:val="000000"/>
                 <w:sz w:val="18"/>
               </w:rPr>
-              <w:t>Rotary Encoders</w:t>
+              <w:t>Status LEDs</w:t>
             </w:r>
           </w:p>
         </w:tc>
@@ -13970,7 +13970,7 @@
                 <w:color w:val="000000"/>
                 <w:sz w:val="18"/>
               </w:rPr>
-              <w:t>User Input</w:t>
+              <w:t>Status Annunciation</w:t>
             </w:r>
           </w:p>
         </w:tc>
@@ -13992,7 +13992,7 @@
                 <w:color w:val="000000"/>
                 <w:sz w:val="18"/>
               </w:rPr>
-              <w:t>Timer Encoder Interface</w:t>
+              <w:t>GPIO Digital Outputs</w:t>
             </w:r>
           </w:p>
         </w:tc>
@@ -14014,7 +14014,7 @@
                 <w:color w:val="000000"/>
                 <w:sz w:val="18"/>
               </w:rPr>
-              <w:t>Hardware quadrature decoding of dual rotary dials with debounced push-switches</w:t>
+              <w:t>Drives Green (Active), Amber (Limit), and Red (Fault) status indicator LEDs</w:t>
             </w:r>
           </w:p>
         </w:tc>
@@ -14085,7 +14085,7 @@
                 <w:color w:val="000000"/>
                 <w:sz w:val="18"/>
               </w:rPr>
-              <w:t>Mode LEDs</w:t>
+              <w:t>LM5176 Enable Pin</w:t>
             </w:r>
           </w:p>
         </w:tc>
@@ -14107,7 +14107,7 @@
                 <w:color w:val="000000"/>
                 <w:sz w:val="18"/>
               </w:rPr>
-              <w:t>Status Annunciation</w:t>
+              <w:t>Output Control</w:t>
             </w:r>
           </w:p>
         </w:tc>
@@ -14129,7 +14129,7 @@
                 <w:color w:val="000000"/>
                 <w:sz w:val="18"/>
               </w:rPr>
-              <w:t>GPIO Digital Outputs</w:t>
+              <w:t>GPIO Digital Output</w:t>
             </w:r>
           </w:p>
         </w:tc>
@@ -14151,7 +14151,7 @@
                 <w:color w:val="000000"/>
                 <w:sz w:val="18"/>
               </w:rPr>
-              <w:t>Drives Green (CV), Amber (CC), and Red (Fault) status indicator LEDs</w:t>
+              <w:t>Controls post-regulator run state during standby, soft-start, and fault disable</w:t>
             </w:r>
           </w:p>
         </w:tc>
@@ -14179,143 +14179,6 @@
                 <w:sz w:val="18"/>
               </w:rPr>
               <w:t>9</w:t>
-            </w:r>
-          </w:p>
-        </w:tc>
-        <w:tc>
-          <w:tcPr>
-            <w:tcW w:type="dxa" w:w="1655"/>
-            <w:vAlign w:val="center"/>
-          </w:tcPr>
-          <w:p>
-            <w:pPr>
-              <w:spacing w:before="40" w:after="40" w:line="252" w:lineRule="auto"/>
-              <w:jc w:val="left"/>
-            </w:pPr>
-            <w:r/>
-            <w:r>
-              <w:rPr>
-                <w:rFonts w:ascii="Arial" w:hAnsi="Arial"/>
-                <w:b w:val="0"/>
-                <w:color w:val="000000"/>
-                <w:sz w:val="18"/>
-              </w:rPr>
-              <w:t>STM32G474 MCU</w:t>
-            </w:r>
-          </w:p>
-        </w:tc>
-        <w:tc>
-          <w:tcPr>
-            <w:tcW w:type="dxa" w:w="1655"/>
-            <w:vAlign w:val="center"/>
-          </w:tcPr>
-          <w:p>
-            <w:pPr>
-              <w:spacing w:before="40" w:after="40" w:line="252" w:lineRule="auto"/>
-              <w:jc w:val="left"/>
-            </w:pPr>
-            <w:r/>
-            <w:r>
-              <w:rPr>
-                <w:rFonts w:ascii="Arial" w:hAnsi="Arial"/>
-                <w:b w:val="0"/>
-                <w:color w:val="000000"/>
-                <w:sz w:val="18"/>
-              </w:rPr>
-              <w:t>LM5176 Enable Pin</w:t>
-            </w:r>
-          </w:p>
-        </w:tc>
-        <w:tc>
-          <w:tcPr>
-            <w:tcW w:type="dxa" w:w="1655"/>
-            <w:vAlign w:val="center"/>
-          </w:tcPr>
-          <w:p>
-            <w:pPr>
-              <w:spacing w:before="40" w:after="40" w:line="252" w:lineRule="auto"/>
-              <w:jc w:val="left"/>
-            </w:pPr>
-            <w:r/>
-            <w:r>
-              <w:rPr>
-                <w:rFonts w:ascii="Arial" w:hAnsi="Arial"/>
-                <w:b w:val="0"/>
-                <w:color w:val="000000"/>
-                <w:sz w:val="18"/>
-              </w:rPr>
-              <w:t>Output Control</w:t>
-            </w:r>
-          </w:p>
-        </w:tc>
-        <w:tc>
-          <w:tcPr>
-            <w:tcW w:type="dxa" w:w="1655"/>
-            <w:vAlign w:val="center"/>
-          </w:tcPr>
-          <w:p>
-            <w:pPr>
-              <w:spacing w:before="40" w:after="40" w:line="252" w:lineRule="auto"/>
-              <w:jc w:val="left"/>
-            </w:pPr>
-            <w:r/>
-            <w:r>
-              <w:rPr>
-                <w:rFonts w:ascii="Arial" w:hAnsi="Arial"/>
-                <w:b w:val="0"/>
-                <w:color w:val="000000"/>
-                <w:sz w:val="18"/>
-              </w:rPr>
-              <w:t>GPIO Digital Output</w:t>
-            </w:r>
-          </w:p>
-        </w:tc>
-        <w:tc>
-          <w:tcPr>
-            <w:tcW w:type="dxa" w:w="2044"/>
-            <w:vAlign w:val="center"/>
-          </w:tcPr>
-          <w:p>
-            <w:pPr>
-              <w:spacing w:before="40" w:after="40" w:line="252" w:lineRule="auto"/>
-              <w:jc w:val="left"/>
-            </w:pPr>
-            <w:r/>
-            <w:r>
-              <w:rPr>
-                <w:rFonts w:ascii="Arial" w:hAnsi="Arial"/>
-                <w:b w:val="0"/>
-                <w:color w:val="000000"/>
-                <w:sz w:val="18"/>
-              </w:rPr>
-              <w:t>Controls post-regulator run state during standby, soft-start, and fault trip</w:t>
-            </w:r>
-          </w:p>
-        </w:tc>
-      </w:tr>
-      <w:tr>
-        <w:trPr>
-          <w:cantSplit/>
-        </w:trPr>
-        <w:tc>
-          <w:tcPr>
-            <w:tcW w:type="dxa" w:w="648"/>
-            <w:vAlign w:val="center"/>
-          </w:tcPr>
-          <w:p>
-            <w:pPr>
-              <w:spacing w:before="40" w:after="40" w:line="252" w:lineRule="auto"/>
-              <w:jc w:val="left"/>
-            </w:pPr>
-            <w:r/>
-            <w:r>
-              <w:rPr>
-                <w:rFonts w:ascii="Arial" w:hAnsi="Arial"/>
-                <w:b/>
-                <w:color w:val="000000"/>
-                <w:sz w:val="18"/>
-              </w:rPr>
-              <w:t>10</w:t>
             </w:r>
           </w:p>
         </w:tc>
@@ -15407,7 +15270,7 @@
         </w:rPr>
       </w:pPr>
       <w:r>
-        <w:t>System 1 represents the physical Hardware Power Supply Module, comprising the universal AC input, EMI filter, isolated Quasi-Resonant Flyback stage, 4-switch synchronous Buck-Boost post-regulator, analog protection circuits, and microcontroller sensing core. The detailed engineering specifications are defined in the tables below:</w:t>
+        <w:t>System 1 represents the physical Hardware Power Supply Module, comprising the universal AC input, EMI filter, isolated Quasi-Resonant Flyback stage, 4-switch synchronous Buck-Boost post-regulator, built-in controller hardware protection, and microcontroller sensing core. The detailed engineering specifications are defined in the tables below:</w:t>
       </w:r>
     </w:p>
     <w:p>
@@ -17135,7 +16998,7 @@
                 <w:color w:val="000000"/>
                 <w:sz w:val="17"/>
               </w:rPr>
-              <w:t>Current Limit Resolution</w:t>
+              <w:t>Output Voltage Ripple</w:t>
             </w:r>
           </w:p>
         </w:tc>
@@ -17157,7 +17020,7 @@
                 <w:color w:val="000000"/>
                 <w:sz w:val="17"/>
               </w:rPr>
-              <w:t>10 mA step resolution (12-bit DAC) [MUST]</w:t>
+              <w:t>&lt; 25 mV pk-pk ripple [MUST]</w:t>
             </w:r>
           </w:p>
         </w:tc>
@@ -17179,7 +17042,7 @@
                 <w:color w:val="000000"/>
                 <w:sz w:val="17"/>
               </w:rPr>
-              <w:t>Reference input to comparator</w:t>
+              <w:t>Full load 3A, 20MHz bandwidth</w:t>
             </w:r>
           </w:p>
         </w:tc>
@@ -17201,7 +17064,7 @@
                 <w:color w:val="000000"/>
                 <w:sz w:val="17"/>
               </w:rPr>
-              <w:t>Current Clamp Tuning</w:t>
+              <w:t>Scope Tip-and-Barrel Probe</w:t>
             </w:r>
           </w:p>
         </w:tc>
@@ -17250,7 +17113,7 @@
                 <w:color w:val="000000"/>
                 <w:sz w:val="17"/>
               </w:rPr>
-              <w:t>Output Voltage Ripple</w:t>
+              <w:t>Load Transient Recovery</w:t>
             </w:r>
           </w:p>
         </w:tc>
@@ -17272,7 +17135,7 @@
                 <w:color w:val="000000"/>
                 <w:sz w:val="17"/>
               </w:rPr>
-              <w:t>&lt; 25 mV pk-pk ripple [MUST]</w:t>
+              <w:t>&lt; 150 µs recovery, &lt; 250mV sag [MUST]</w:t>
             </w:r>
           </w:p>
         </w:tc>
@@ -17294,7 +17157,7 @@
                 <w:color w:val="000000"/>
                 <w:sz w:val="17"/>
               </w:rPr>
-              <w:t>Full load 3A, 20MHz bandwidth</w:t>
+              <w:t>50% to 100% load step (1.5A to 3A)</w:t>
             </w:r>
           </w:p>
         </w:tc>
@@ -17316,7 +17179,7 @@
                 <w:color w:val="000000"/>
                 <w:sz w:val="17"/>
               </w:rPr>
-              <w:t>Scope Tip-and-Barrel Probe</w:t>
+              <w:t>Dynamic Load Stepper</w:t>
             </w:r>
           </w:p>
         </w:tc>
@@ -17365,7 +17228,7 @@
                 <w:color w:val="000000"/>
                 <w:sz w:val="17"/>
               </w:rPr>
-              <w:t>Load Transient Recovery</w:t>
+              <w:t>Buck-Boost Efficiency</w:t>
             </w:r>
           </w:p>
         </w:tc>
@@ -17387,7 +17250,7 @@
                 <w:color w:val="000000"/>
                 <w:sz w:val="17"/>
               </w:rPr>
-              <w:t>&lt; 120 µs recovery, &lt; 250mV sag [MUST]</w:t>
+              <w:t>&gt; 95.0% @ 20V/3A; &gt; 92.0% @ 5V/3A [MUST]</w:t>
             </w:r>
           </w:p>
         </w:tc>
@@ -17409,7 +17272,7 @@
                 <w:color w:val="000000"/>
                 <w:sz w:val="17"/>
               </w:rPr>
-              <w:t>50% to 100% load step (1.5A to 3A)</w:t>
+              <w:t>Vin = 24V, Sync Rectification</w:t>
             </w:r>
           </w:p>
         </w:tc>
@@ -17431,7 +17294,7 @@
                 <w:color w:val="000000"/>
                 <w:sz w:val="17"/>
               </w:rPr>
-              <w:t>Dynamic Load Stepper</w:t>
+              <w:t>Dual-Channel Power Meter</w:t>
             </w:r>
           </w:p>
         </w:tc>
@@ -17480,7 +17343,7 @@
                 <w:color w:val="000000"/>
                 <w:sz w:val="17"/>
               </w:rPr>
-              <w:t>Buck-Boost Efficiency</w:t>
+              <w:t>Switching Frequency</w:t>
             </w:r>
           </w:p>
         </w:tc>
@@ -17502,7 +17365,7 @@
                 <w:color w:val="000000"/>
                 <w:sz w:val="17"/>
               </w:rPr>
-              <w:t>&gt; 95.0% @ 20V/3A; &gt; 92.0% @ 5V/3A [MUST]</w:t>
+              <w:t>300 kHz ± 10% [MUST]</w:t>
             </w:r>
           </w:p>
         </w:tc>
@@ -17524,7 +17387,7 @@
                 <w:color w:val="000000"/>
                 <w:sz w:val="17"/>
               </w:rPr>
-              <w:t>Vin = 24V, Sync Rectification</w:t>
+              <w:t>Fixed frequency PWM</w:t>
             </w:r>
           </w:p>
         </w:tc>
@@ -17546,7 +17409,7 @@
                 <w:color w:val="000000"/>
                 <w:sz w:val="17"/>
               </w:rPr>
-              <w:t>Dual-Channel Power Meter</w:t>
+              <w:t>Frequency Counter / Scope</w:t>
             </w:r>
           </w:p>
         </w:tc>
@@ -17595,7 +17458,7 @@
                 <w:color w:val="000000"/>
                 <w:sz w:val="17"/>
               </w:rPr>
-              <w:t>Switching Frequency</w:t>
+              <w:t>Hardware Current Limiting</w:t>
             </w:r>
           </w:p>
         </w:tc>
@@ -17617,7 +17480,7 @@
                 <w:color w:val="000000"/>
                 <w:sz w:val="17"/>
               </w:rPr>
-              <w:t>300 kHz ± 10% [MUST]</w:t>
+              <w:t>Cycle-by-cycle current limit via CSP/CSN [MUST]</w:t>
             </w:r>
           </w:p>
         </w:tc>
@@ -17639,7 +17502,7 @@
                 <w:color w:val="000000"/>
                 <w:sz w:val="17"/>
               </w:rPr>
-              <w:t>Fixed frequency PWM</w:t>
+              <w:t>Overload condition</w:t>
             </w:r>
           </w:p>
         </w:tc>
@@ -17661,122 +17524,7 @@
                 <w:color w:val="000000"/>
                 <w:sz w:val="17"/>
               </w:rPr>
-              <w:t>Frequency Counter</w:t>
-            </w:r>
-          </w:p>
-        </w:tc>
-      </w:tr>
-      <w:tr>
-        <w:trPr>
-          <w:cantSplit/>
-        </w:trPr>
-        <w:tc>
-          <w:tcPr>
-            <w:tcW w:type="dxa" w:w="1080"/>
-            <w:vAlign w:val="center"/>
-          </w:tcPr>
-          <w:p>
-            <w:pPr>
-              <w:spacing w:before="40" w:after="40" w:line="252" w:lineRule="auto"/>
-              <w:jc w:val="center"/>
-            </w:pPr>
-            <w:r/>
-            <w:r>
-              <w:rPr>
-                <w:rFonts w:ascii="Arial" w:hAnsi="Arial"/>
-                <w:b/>
-                <w:color w:val="000000"/>
-                <w:sz w:val="17"/>
-              </w:rPr>
-              <w:t>BB-10</w:t>
-            </w:r>
-          </w:p>
-        </w:tc>
-        <w:tc>
-          <w:tcPr>
-            <w:tcW w:type="dxa" w:w="2448"/>
-            <w:vAlign w:val="center"/>
-          </w:tcPr>
-          <w:p>
-            <w:pPr>
-              <w:spacing w:before="40" w:after="40" w:line="252" w:lineRule="auto"/>
-              <w:jc w:val="left"/>
-            </w:pPr>
-            <w:r/>
-            <w:r>
-              <w:rPr>
-                <w:rFonts w:ascii="Arial" w:hAnsi="Arial"/>
-                <w:b w:val="0"/>
-                <w:color w:val="000000"/>
-                <w:sz w:val="17"/>
-              </w:rPr>
-              <w:t>CC Mode Reaction Time</w:t>
-            </w:r>
-          </w:p>
-        </w:tc>
-        <w:tc>
-          <w:tcPr>
-            <w:tcW w:type="dxa" w:w="2448"/>
-            <w:vAlign w:val="center"/>
-          </w:tcPr>
-          <w:p>
-            <w:pPr>
-              <w:spacing w:before="40" w:after="40" w:line="252" w:lineRule="auto"/>
-              <w:jc w:val="left"/>
-            </w:pPr>
-            <w:r/>
-            <w:r>
-              <w:rPr>
-                <w:rFonts w:ascii="Arial" w:hAnsi="Arial"/>
-                <w:b w:val="0"/>
-                <w:color w:val="000000"/>
-                <w:sz w:val="17"/>
-              </w:rPr>
-              <w:t>&lt; 5.0 µs autonomous clamping [MUST]</w:t>
-            </w:r>
-          </w:p>
-        </w:tc>
-        <w:tc>
-          <w:tcPr>
-            <w:tcW w:type="dxa" w:w="1612"/>
-            <w:vAlign w:val="center"/>
-          </w:tcPr>
-          <w:p>
-            <w:pPr>
-              <w:spacing w:before="40" w:after="40" w:line="252" w:lineRule="auto"/>
-              <w:jc w:val="left"/>
-            </w:pPr>
-            <w:r/>
-            <w:r>
-              <w:rPr>
-                <w:rFonts w:ascii="Arial" w:hAnsi="Arial"/>
-                <w:b w:val="0"/>
-                <w:color w:val="000000"/>
-                <w:sz w:val="17"/>
-              </w:rPr>
-              <w:t>Overload short-circuit step</w:t>
-            </w:r>
-          </w:p>
-        </w:tc>
-        <w:tc>
-          <w:tcPr>
-            <w:tcW w:type="dxa" w:w="1728"/>
-            <w:vAlign w:val="center"/>
-          </w:tcPr>
-          <w:p>
-            <w:pPr>
-              <w:spacing w:before="40" w:after="40" w:line="252" w:lineRule="auto"/>
-              <w:jc w:val="left"/>
-            </w:pPr>
-            <w:r/>
-            <w:r>
-              <w:rPr>
-                <w:rFonts w:ascii="Arial" w:hAnsi="Arial"/>
-                <w:b w:val="0"/>
-                <w:color w:val="000000"/>
-                <w:sz w:val="17"/>
-              </w:rPr>
-              <w:t>Fast Current Shunt Scope</w:t>
+              <w:t>Current Probe &amp; Scope</w:t>
             </w:r>
           </w:p>
         </w:tc>
@@ -18042,7 +17790,7 @@
                 <w:color w:val="000000"/>
                 <w:sz w:val="17"/>
               </w:rPr>
-              <w:t>Precision AC Source Ref</w:t>
+              <w:t>Precision AC Source Reference</w:t>
             </w:r>
           </w:p>
         </w:tc>
@@ -18135,7 +17883,7 @@
                 <w:color w:val="000000"/>
                 <w:sz w:val="17"/>
               </w:rPr>
-              <w:t>± 1.5% accuracy from 0.1A-2A</w:t>
+              <w:t>± 1.5% accuracy from 0.1A–2A</w:t>
             </w:r>
           </w:p>
         </w:tc>
@@ -18272,7 +18020,7 @@
                 <w:color w:val="000000"/>
                 <w:sz w:val="17"/>
               </w:rPr>
-              <w:t>Keysight 34465A DMM</w:t>
+              <w:t>Keysight 34465A 6.5-digit DMM</w:t>
             </w:r>
           </w:p>
         </w:tc>
@@ -18502,7 +18250,7 @@
                 <w:color w:val="000000"/>
                 <w:sz w:val="17"/>
               </w:rPr>
-              <w:t>Timing Logic Analyzer</w:t>
+              <w:t>Logic Analyzer Timing Check</w:t>
             </w:r>
           </w:p>
         </w:tc>
@@ -18666,7 +18414,7 @@
                 <w:color w:val="000000"/>
                 <w:sz w:val="17"/>
               </w:rPr>
-              <w:t>Hardware Calibration Test Points</w:t>
+              <w:t>Calibration Test Points</w:t>
             </w:r>
           </w:p>
         </w:tc>
@@ -18688,7 +18436,7 @@
                 <w:color w:val="000000"/>
                 <w:sz w:val="17"/>
               </w:rPr>
-              <w:t>Dedicated PCB Test Points [MUST]</w:t>
+              <w:t>Dedicated PCB Test Loops [MUST]</w:t>
             </w:r>
           </w:p>
         </w:tc>
@@ -18710,7 +18458,7 @@
                 <w:color w:val="000000"/>
                 <w:sz w:val="17"/>
               </w:rPr>
-              <w:t>Vout, Iout, bulk DC, and aux rails</w:t>
+              <w:t>Vout, bulk DC, and aux rails</w:t>
             </w:r>
           </w:p>
         </w:tc>
@@ -18732,7 +18480,7 @@
                 <w:color w:val="000000"/>
                 <w:sz w:val="17"/>
               </w:rPr>
-              <w:t>Scope &amp; Multimeter Check</w:t>
+              <w:t>Scope &amp; Multimeter Inspection</w:t>
             </w:r>
           </w:p>
         </w:tc>
@@ -18932,7 +18680,7 @@
                 <w:color w:val="000000"/>
                 <w:sz w:val="17"/>
               </w:rPr>
-              <w:t>Hardware Over-Voltage (OVP)</w:t>
+              <w:t>Input Fuse Protection</w:t>
             </w:r>
           </w:p>
         </w:tc>
@@ -18954,7 +18702,7 @@
                 <w:color w:val="000000"/>
                 <w:sz w:val="17"/>
               </w:rPr>
-              <w:t>Clamps at Vset + 1.5V (&lt; 5µs response) [MUST]</w:t>
+              <w:t>2.0A Time-Lag Ceramic Fuse [MUST]</w:t>
             </w:r>
           </w:p>
         </w:tc>
@@ -18976,7 +18724,7 @@
                 <w:color w:val="000000"/>
                 <w:sz w:val="17"/>
               </w:rPr>
-              <w:t>Independent comparator crowbar</w:t>
+              <w:t>AC mains short-circuit</w:t>
             </w:r>
           </w:p>
         </w:tc>
@@ -18998,7 +18746,7 @@
                 <w:color w:val="000000"/>
                 <w:sz w:val="17"/>
               </w:rPr>
-              <w:t>OVP Trip Verification</w:t>
+              <w:t>Overcurrent Trip Test</w:t>
             </w:r>
           </w:p>
         </w:tc>
@@ -19047,7 +18795,7 @@
                 <w:color w:val="000000"/>
                 <w:sz w:val="17"/>
               </w:rPr>
-              <w:t>Hardware Constant-Current (CC)</w:t>
+              <w:t>Input Inrush Current Limit</w:t>
             </w:r>
           </w:p>
         </w:tc>
@@ -19069,7 +18817,7 @@
                 <w:color w:val="000000"/>
                 <w:sz w:val="17"/>
               </w:rPr>
-              <w:t>Clamps at Iset ± 20mA (&lt; 5µs reaction) [MUST]</w:t>
+              <w:t>10Ω NTC Thermistor (&lt; 25A peak) [MUST]</w:t>
             </w:r>
           </w:p>
         </w:tc>
@@ -19091,7 +18839,7 @@
                 <w:color w:val="000000"/>
                 <w:sz w:val="17"/>
               </w:rPr>
-              <w:t>Analog pull-down on COMP pin</w:t>
+              <w:t>Cold start at 265V AC</w:t>
             </w:r>
           </w:p>
         </w:tc>
@@ -19113,7 +18861,7 @@
                 <w:color w:val="000000"/>
                 <w:sz w:val="17"/>
               </w:rPr>
-              <w:t>Direct Dead Short Test</w:t>
+              <w:t>Scope Current Probe</w:t>
             </w:r>
           </w:p>
         </w:tc>
@@ -19162,7 +18910,7 @@
                 <w:color w:val="000000"/>
                 <w:sz w:val="17"/>
               </w:rPr>
-              <w:t>Over-Temperature (OTP)</w:t>
+              <w:t>AC Line Surge Protection</w:t>
             </w:r>
           </w:p>
         </w:tc>
@@ -19184,7 +18932,7 @@
                 <w:color w:val="000000"/>
                 <w:sz w:val="17"/>
               </w:rPr>
-              <w:t>Shuts down at Tpcb &gt; 90°C (10°C hyst) [MUST]</w:t>
+              <w:t>300V RMS MOV (4.5kA rating) [MUST]</w:t>
             </w:r>
           </w:p>
         </w:tc>
@@ -19206,7 +18954,7 @@
                 <w:color w:val="000000"/>
                 <w:sz w:val="17"/>
               </w:rPr>
-              <w:t>NTC thermistor monitoring</w:t>
+              <w:t>Line transients per IEC 61000-4-5</w:t>
             </w:r>
           </w:p>
         </w:tc>
@@ -19228,7 +18976,7 @@
                 <w:color w:val="000000"/>
                 <w:sz w:val="17"/>
               </w:rPr>
-              <w:t>Thermal Chamber Ramp</w:t>
+              <w:t>Surge Generator Verification</w:t>
             </w:r>
           </w:p>
         </w:tc>
@@ -19277,7 +19025,7 @@
                 <w:color w:val="000000"/>
                 <w:sz w:val="17"/>
               </w:rPr>
-              <w:t>Safety Compliance Standard</w:t>
+              <w:t>Built-in Controller OCP</w:t>
             </w:r>
           </w:p>
         </w:tc>
@@ -19299,7 +19047,7 @@
                 <w:color w:val="000000"/>
                 <w:sz w:val="17"/>
               </w:rPr>
-              <w:t>IEC 62368-1 Reinforced Isolation [MUST]</w:t>
+              <w:t>LM5176 cycle-by-cycle CSP/CSN clamp [MUST]</w:t>
             </w:r>
           </w:p>
         </w:tc>
@@ -19321,7 +19069,7 @@
                 <w:color w:val="000000"/>
                 <w:sz w:val="17"/>
               </w:rPr>
-              <w:t>SELV touch-safe (&lt; 60V DC)</w:t>
+              <w:t>Load current &gt; 3.5A limit</w:t>
             </w:r>
           </w:p>
         </w:tc>
@@ -19343,7 +19091,7 @@
                 <w:color w:val="000000"/>
                 <w:sz w:val="17"/>
               </w:rPr>
-              <w:t>Certified Safety Lab</w:t>
+              <w:t>Electronic Load Step</w:t>
             </w:r>
           </w:p>
         </w:tc>
@@ -19392,7 +19140,7 @@
                 <w:color w:val="000000"/>
                 <w:sz w:val="17"/>
               </w:rPr>
-              <w:t>Creepage &amp; Clearance</w:t>
+              <w:t>Over-Temperature (OTP)</w:t>
             </w:r>
           </w:p>
         </w:tc>
@@ -19414,7 +19162,7 @@
                 <w:color w:val="000000"/>
                 <w:sz w:val="17"/>
               </w:rPr>
-              <w:t>Creepage &gt;= 6.4mm; Clearance &gt;= 5.0mm [MUST]</w:t>
+              <w:t>LM5176 internal shutdown (165°C) [MUST]</w:t>
             </w:r>
           </w:p>
         </w:tc>
@@ -19436,7 +19184,7 @@
                 <w:color w:val="000000"/>
                 <w:sz w:val="17"/>
               </w:rPr>
-              <w:t>Primary-Secondary milled slot</w:t>
+              <w:t>Severe thermal rise</w:t>
             </w:r>
           </w:p>
         </w:tc>
@@ -19458,7 +19206,7 @@
                 <w:color w:val="000000"/>
                 <w:sz w:val="17"/>
               </w:rPr>
-              <w:t>PCB Mechanical Caliper</w:t>
+              <w:t>Thermal Chamber Sweep</w:t>
             </w:r>
           </w:p>
         </w:tc>
@@ -19507,7 +19255,7 @@
                 <w:color w:val="000000"/>
                 <w:sz w:val="17"/>
               </w:rPr>
-              <w:t>Conducted &amp; Radiated EMC</w:t>
+              <w:t>Safety Compliance Standard</w:t>
             </w:r>
           </w:p>
         </w:tc>
@@ -19529,7 +19277,7 @@
                 <w:color w:val="000000"/>
                 <w:sz w:val="17"/>
               </w:rPr>
-              <w:t>CISPR 32 / EN 55032 Class B [MUST]</w:t>
+              <w:t>IEC 62368-1 Reinforced Isolation [MUST]</w:t>
             </w:r>
           </w:p>
         </w:tc>
@@ -19551,7 +19299,7 @@
                 <w:color w:val="000000"/>
                 <w:sz w:val="17"/>
               </w:rPr>
-              <w:t>150 kHz – 1 GHz emission limits</w:t>
+              <w:t>SELV touch-safe (&lt; 60V DC)</w:t>
             </w:r>
           </w:p>
         </w:tc>
@@ -19573,7 +19321,7 @@
                 <w:color w:val="000000"/>
                 <w:sz w:val="17"/>
               </w:rPr>
-              <w:t>Semi-Anechoic Chamber</w:t>
+              <w:t>Certified Safety Laboratory</w:t>
             </w:r>
           </w:p>
         </w:tc>
@@ -19622,7 +19370,7 @@
                 <w:color w:val="000000"/>
                 <w:sz w:val="17"/>
               </w:rPr>
-              <w:t>Operating Ambient Temp</w:t>
+              <w:t>Creepage &amp; Clearance</w:t>
             </w:r>
           </w:p>
         </w:tc>
@@ -19644,7 +19392,7 @@
                 <w:color w:val="000000"/>
                 <w:sz w:val="17"/>
               </w:rPr>
-              <w:t>-20°C to +50°C Full Load [MUST]</w:t>
+              <w:t>Creepage ≥ 6.4mm; Clearance ≥ 5.0mm [MUST]</w:t>
             </w:r>
           </w:p>
         </w:tc>
@@ -19666,7 +19414,7 @@
                 <w:color w:val="000000"/>
                 <w:sz w:val="17"/>
               </w:rPr>
-              <w:t>Natural convection in chassis</w:t>
+              <w:t>Primary-Secondary milled slot</w:t>
             </w:r>
           </w:p>
         </w:tc>
@@ -19688,7 +19436,7 @@
                 <w:color w:val="000000"/>
                 <w:sz w:val="17"/>
               </w:rPr>
-              <w:t>Environmental Chamber</w:t>
+              <w:t>PCB Caliper &amp; Gerber Check</w:t>
             </w:r>
           </w:p>
         </w:tc>
@@ -19737,7 +19485,7 @@
                 <w:color w:val="000000"/>
                 <w:sz w:val="17"/>
               </w:rPr>
-              <w:t>Mean Time Between Failures</w:t>
+              <w:t>Conducted &amp; Radiated EMC</w:t>
             </w:r>
           </w:p>
         </w:tc>
@@ -19759,7 +19507,7 @@
                 <w:color w:val="000000"/>
                 <w:sz w:val="17"/>
               </w:rPr>
-              <w:t>MTBF &gt; 50,000 Hours @ 40°C [SHOULD]</w:t>
+              <w:t>CISPR 32 / EN 55032 Class B [MUST]</w:t>
             </w:r>
           </w:p>
         </w:tc>
@@ -19781,7 +19529,7 @@
                 <w:color w:val="000000"/>
                 <w:sz w:val="17"/>
               </w:rPr>
-              <w:t>Telcordia SR-332 Parts Count</w:t>
+              <w:t>150 kHz – 1 GHz emission limits</w:t>
             </w:r>
           </w:p>
         </w:tc>
@@ -19803,7 +19551,122 @@
                 <w:color w:val="000000"/>
                 <w:sz w:val="17"/>
               </w:rPr>
-              <w:t>Reliability Calculation</w:t>
+              <w:t>Semi-Anechoic Chamber</w:t>
+            </w:r>
+          </w:p>
+        </w:tc>
+      </w:tr>
+      <w:tr>
+        <w:trPr>
+          <w:cantSplit/>
+        </w:trPr>
+        <w:tc>
+          <w:tcPr>
+            <w:tcW w:type="dxa" w:w="1080"/>
+            <w:vAlign w:val="center"/>
+          </w:tcPr>
+          <w:p>
+            <w:pPr>
+              <w:spacing w:before="40" w:after="40" w:line="252" w:lineRule="auto"/>
+              <w:jc w:val="center"/>
+            </w:pPr>
+            <w:r/>
+            <w:r>
+              <w:rPr>
+                <w:rFonts w:ascii="Arial" w:hAnsi="Arial"/>
+                <w:b/>
+                <w:color w:val="000000"/>
+                <w:sz w:val="17"/>
+              </w:rPr>
+              <w:t>PR-09</w:t>
+            </w:r>
+          </w:p>
+        </w:tc>
+        <w:tc>
+          <w:tcPr>
+            <w:tcW w:type="dxa" w:w="2448"/>
+            <w:vAlign w:val="center"/>
+          </w:tcPr>
+          <w:p>
+            <w:pPr>
+              <w:spacing w:before="40" w:after="40" w:line="252" w:lineRule="auto"/>
+              <w:jc w:val="left"/>
+            </w:pPr>
+            <w:r/>
+            <w:r>
+              <w:rPr>
+                <w:rFonts w:ascii="Arial" w:hAnsi="Arial"/>
+                <w:b w:val="0"/>
+                <w:color w:val="000000"/>
+                <w:sz w:val="17"/>
+              </w:rPr>
+              <w:t>Operating Ambient Temp</w:t>
+            </w:r>
+          </w:p>
+        </w:tc>
+        <w:tc>
+          <w:tcPr>
+            <w:tcW w:type="dxa" w:w="2448"/>
+            <w:vAlign w:val="center"/>
+          </w:tcPr>
+          <w:p>
+            <w:pPr>
+              <w:spacing w:before="40" w:after="40" w:line="252" w:lineRule="auto"/>
+              <w:jc w:val="left"/>
+            </w:pPr>
+            <w:r/>
+            <w:r>
+              <w:rPr>
+                <w:rFonts w:ascii="Arial" w:hAnsi="Arial"/>
+                <w:b w:val="0"/>
+                <w:color w:val="000000"/>
+                <w:sz w:val="17"/>
+              </w:rPr>
+              <w:t>–20°C to +50°C Full Load [MUST]</w:t>
+            </w:r>
+          </w:p>
+        </w:tc>
+        <w:tc>
+          <w:tcPr>
+            <w:tcW w:type="dxa" w:w="1612"/>
+            <w:vAlign w:val="center"/>
+          </w:tcPr>
+          <w:p>
+            <w:pPr>
+              <w:spacing w:before="40" w:after="40" w:line="252" w:lineRule="auto"/>
+              <w:jc w:val="left"/>
+            </w:pPr>
+            <w:r/>
+            <w:r>
+              <w:rPr>
+                <w:rFonts w:ascii="Arial" w:hAnsi="Arial"/>
+                <w:b w:val="0"/>
+                <w:color w:val="000000"/>
+                <w:sz w:val="17"/>
+              </w:rPr>
+              <w:t>Natural convection in chassis</w:t>
+            </w:r>
+          </w:p>
+        </w:tc>
+        <w:tc>
+          <w:tcPr>
+            <w:tcW w:type="dxa" w:w="1728"/>
+            <w:vAlign w:val="center"/>
+          </w:tcPr>
+          <w:p>
+            <w:pPr>
+              <w:spacing w:before="40" w:after="40" w:line="252" w:lineRule="auto"/>
+              <w:jc w:val="left"/>
+            </w:pPr>
+            <w:r/>
+            <w:r>
+              <w:rPr>
+                <w:rFonts w:ascii="Arial" w:hAnsi="Arial"/>
+                <w:b w:val="0"/>
+                <w:color w:val="000000"/>
+                <w:sz w:val="17"/>
+              </w:rPr>
+              <w:t>Environmental Chamber</w:t>
             </w:r>
           </w:p>
         </w:tc>
@@ -20707,7 +20570,7 @@
                 <w:color w:val="000000"/>
                 <w:sz w:val="17"/>
               </w:rPr>
-              <w:t>Line/Load Voltage Sweep</w:t>
+              <w:t>Precision Line/Load Sweep</w:t>
             </w:r>
           </w:p>
         </w:tc>
@@ -20871,7 +20734,7 @@
                 <w:color w:val="000000"/>
                 <w:sz w:val="17"/>
               </w:rPr>
-              <w:t>Hardware Current Sense Shunt</w:t>
+              <w:t>Current Sense Resistor</w:t>
             </w:r>
           </w:p>
         </w:tc>
@@ -20915,7 +20778,7 @@
                 <w:color w:val="000000"/>
                 <w:sz w:val="17"/>
               </w:rPr>
-              <w:t>4-wire Kelvin sensing layout</w:t>
+              <w:t>Connected across LM5176 CSP/CSN</w:t>
             </w:r>
           </w:p>
         </w:tc>
@@ -20937,7 +20800,7 @@
                 <w:color w:val="000000"/>
                 <w:sz w:val="17"/>
               </w:rPr>
-              <w:t>Precision Shunt DMM Check</w:t>
+              <w:t>Precision Milliohm Meter</w:t>
             </w:r>
           </w:p>
         </w:tc>
@@ -20986,7 +20849,7 @@
                 <w:color w:val="000000"/>
                 <w:sz w:val="17"/>
               </w:rPr>
-              <w:t>Current Sense Amplification</w:t>
+              <w:t>MCU Supervisory Shutdown</w:t>
             </w:r>
           </w:p>
         </w:tc>
@@ -21008,7 +20871,7 @@
                 <w:color w:val="000000"/>
                 <w:sz w:val="17"/>
               </w:rPr>
-              <w:t>INA240A2 Precision Amp (50 V/V gain) [MUST]</w:t>
+              <w:t>GPIO pulling LM5176 ENABLE pin low [MUST]</w:t>
             </w:r>
           </w:p>
         </w:tc>
@@ -21030,7 +20893,7 @@
                 <w:color w:val="000000"/>
                 <w:sz w:val="17"/>
               </w:rPr>
-              <w:t>Enhanced PWM input spike rejection</w:t>
+              <w:t>Software fault shutdown command</w:t>
             </w:r>
           </w:p>
         </w:tc>
@@ -21052,7 +20915,7 @@
                 <w:color w:val="000000"/>
                 <w:sz w:val="17"/>
               </w:rPr>
-              <w:t>Shunt Amp Linearity Sweep</w:t>
+              <w:t>Scope Response Timing</w:t>
             </w:r>
           </w:p>
         </w:tc>
@@ -21101,7 +20964,7 @@
                 <w:color w:val="000000"/>
                 <w:sz w:val="17"/>
               </w:rPr>
-              <w:t>Fast CC Hardware Clamping</w:t>
+              <w:t>Auxiliary Bias Regulation</w:t>
             </w:r>
           </w:p>
         </w:tc>
@@ -21123,7 +20986,7 @@
                 <w:color w:val="000000"/>
                 <w:sz w:val="17"/>
               </w:rPr>
-              <w:t>&lt; 5.0 µs autonomous clamping on COMP pin [MUST]</w:t>
+              <w:t>+14V Flyback VCC, +12V gate, +5V, +3.3V rails [MUST]</w:t>
             </w:r>
           </w:p>
         </w:tc>
@@ -21145,237 +21008,7 @@
                 <w:color w:val="000000"/>
                 <w:sz w:val="17"/>
               </w:rPr>
-              <w:t>TLV3501 4.5ns analog comparator override</w:t>
-            </w:r>
-          </w:p>
-        </w:tc>
-        <w:tc>
-          <w:tcPr>
-            <w:tcW w:type="dxa" w:w="1728"/>
-            <w:vAlign w:val="center"/>
-          </w:tcPr>
-          <w:p>
-            <w:pPr>
-              <w:spacing w:before="40" w:after="40" w:line="252" w:lineRule="auto"/>
-              <w:jc w:val="left"/>
-            </w:pPr>
-            <w:r/>
-            <w:r>
-              <w:rPr>
-                <w:rFonts w:ascii="Arial" w:hAnsi="Arial"/>
-                <w:b w:val="0"/>
-                <w:color w:val="000000"/>
-                <w:sz w:val="17"/>
-              </w:rPr>
-              <w:t>High-Speed Current Probe</w:t>
-            </w:r>
-          </w:p>
-        </w:tc>
-      </w:tr>
-      <w:tr>
-        <w:trPr>
-          <w:cantSplit/>
-        </w:trPr>
-        <w:tc>
-          <w:tcPr>
-            <w:tcW w:type="dxa" w:w="1080"/>
-            <w:vAlign w:val="center"/>
-          </w:tcPr>
-          <w:p>
-            <w:pPr>
-              <w:spacing w:before="40" w:after="40" w:line="252" w:lineRule="auto"/>
-              <w:jc w:val="center"/>
-            </w:pPr>
-            <w:r/>
-            <w:r>
-              <w:rPr>
-                <w:rFonts w:ascii="Arial" w:hAnsi="Arial"/>
-                <w:b/>
-                <w:color w:val="000000"/>
-                <w:sz w:val="17"/>
-              </w:rPr>
-              <w:t>CT-06</w:t>
-            </w:r>
-          </w:p>
-        </w:tc>
-        <w:tc>
-          <w:tcPr>
-            <w:tcW w:type="dxa" w:w="2448"/>
-            <w:vAlign w:val="center"/>
-          </w:tcPr>
-          <w:p>
-            <w:pPr>
-              <w:spacing w:before="40" w:after="40" w:line="252" w:lineRule="auto"/>
-              <w:jc w:val="left"/>
-            </w:pPr>
-            <w:r/>
-            <w:r>
-              <w:rPr>
-                <w:rFonts w:ascii="Arial" w:hAnsi="Arial"/>
-                <w:b w:val="0"/>
-                <w:color w:val="000000"/>
-                <w:sz w:val="17"/>
-              </w:rPr>
-              <w:t>Hardware Crowbar Disconnect</w:t>
-            </w:r>
-          </w:p>
-        </w:tc>
-        <w:tc>
-          <w:tcPr>
-            <w:tcW w:type="dxa" w:w="2448"/>
-            <w:vAlign w:val="center"/>
-          </w:tcPr>
-          <w:p>
-            <w:pPr>
-              <w:spacing w:before="40" w:after="40" w:line="252" w:lineRule="auto"/>
-              <w:jc w:val="left"/>
-            </w:pPr>
-            <w:r/>
-            <w:r>
-              <w:rPr>
-                <w:rFonts w:ascii="Arial" w:hAnsi="Arial"/>
-                <w:b w:val="0"/>
-                <w:color w:val="000000"/>
-                <w:sz w:val="17"/>
-              </w:rPr>
-              <w:t>High-side P-MOSFET disconnect on OVP/OTP [MUST]</w:t>
-            </w:r>
-          </w:p>
-        </w:tc>
-        <w:tc>
-          <w:tcPr>
-            <w:tcW w:type="dxa" w:w="1612"/>
-            <w:vAlign w:val="center"/>
-          </w:tcPr>
-          <w:p>
-            <w:pPr>
-              <w:spacing w:before="40" w:after="40" w:line="252" w:lineRule="auto"/>
-              <w:jc w:val="left"/>
-            </w:pPr>
-            <w:r/>
-            <w:r>
-              <w:rPr>
-                <w:rFonts w:ascii="Arial" w:hAnsi="Arial"/>
-                <w:b w:val="0"/>
-                <w:color w:val="000000"/>
-                <w:sz w:val="17"/>
-              </w:rPr>
-              <w:t>Clamps at Vset + 1.5V in &lt; 5.0 µs</w:t>
-            </w:r>
-          </w:p>
-        </w:tc>
-        <w:tc>
-          <w:tcPr>
-            <w:tcW w:type="dxa" w:w="1728"/>
-            <w:vAlign w:val="center"/>
-          </w:tcPr>
-          <w:p>
-            <w:pPr>
-              <w:spacing w:before="40" w:after="40" w:line="252" w:lineRule="auto"/>
-              <w:jc w:val="left"/>
-            </w:pPr>
-            <w:r/>
-            <w:r>
-              <w:rPr>
-                <w:rFonts w:ascii="Arial" w:hAnsi="Arial"/>
-                <w:b w:val="0"/>
-                <w:color w:val="000000"/>
-                <w:sz w:val="17"/>
-              </w:rPr>
-              <w:t>OVP Transient Injection Test</w:t>
-            </w:r>
-          </w:p>
-        </w:tc>
-      </w:tr>
-      <w:tr>
-        <w:trPr>
-          <w:cantSplit/>
-        </w:trPr>
-        <w:tc>
-          <w:tcPr>
-            <w:tcW w:type="dxa" w:w="1080"/>
-            <w:vAlign w:val="center"/>
-          </w:tcPr>
-          <w:p>
-            <w:pPr>
-              <w:spacing w:before="40" w:after="40" w:line="252" w:lineRule="auto"/>
-              <w:jc w:val="center"/>
-            </w:pPr>
-            <w:r/>
-            <w:r>
-              <w:rPr>
-                <w:rFonts w:ascii="Arial" w:hAnsi="Arial"/>
-                <w:b/>
-                <w:color w:val="000000"/>
-                <w:sz w:val="17"/>
-              </w:rPr>
-              <w:t>CT-07</w:t>
-            </w:r>
-          </w:p>
-        </w:tc>
-        <w:tc>
-          <w:tcPr>
-            <w:tcW w:type="dxa" w:w="2448"/>
-            <w:vAlign w:val="center"/>
-          </w:tcPr>
-          <w:p>
-            <w:pPr>
-              <w:spacing w:before="40" w:after="40" w:line="252" w:lineRule="auto"/>
-              <w:jc w:val="left"/>
-            </w:pPr>
-            <w:r/>
-            <w:r>
-              <w:rPr>
-                <w:rFonts w:ascii="Arial" w:hAnsi="Arial"/>
-                <w:b w:val="0"/>
-                <w:color w:val="000000"/>
-                <w:sz w:val="17"/>
-              </w:rPr>
-              <w:t>Auxiliary Bias Regulation</w:t>
-            </w:r>
-          </w:p>
-        </w:tc>
-        <w:tc>
-          <w:tcPr>
-            <w:tcW w:type="dxa" w:w="2448"/>
-            <w:vAlign w:val="center"/>
-          </w:tcPr>
-          <w:p>
-            <w:pPr>
-              <w:spacing w:before="40" w:after="40" w:line="252" w:lineRule="auto"/>
-              <w:jc w:val="left"/>
-            </w:pPr>
-            <w:r/>
-            <w:r>
-              <w:rPr>
-                <w:rFonts w:ascii="Arial" w:hAnsi="Arial"/>
-                <w:b w:val="0"/>
-                <w:color w:val="000000"/>
-                <w:sz w:val="17"/>
-              </w:rPr>
-              <w:t>+14V Flyback VCC, +12V gate, +5V, +3.3V rails [MUST]</w:t>
-            </w:r>
-          </w:p>
-        </w:tc>
-        <w:tc>
-          <w:tcPr>
-            <w:tcW w:type="dxa" w:w="1612"/>
-            <w:vAlign w:val="center"/>
-          </w:tcPr>
-          <w:p>
-            <w:pPr>
-              <w:spacing w:before="40" w:after="40" w:line="252" w:lineRule="auto"/>
-              <w:jc w:val="left"/>
-            </w:pPr>
-            <w:r/>
-            <w:r>
-              <w:rPr>
-                <w:rFonts w:ascii="Arial" w:hAnsi="Arial"/>
-                <w:b w:val="0"/>
-                <w:color w:val="000000"/>
-                <w:sz w:val="17"/>
-              </w:rPr>
-              <w:t>Dedicated LDOs &amp; buck off +24V bus</w:t>
+              <w:t>Dedicated LDOs &amp; buck off +24V</w:t>
             </w:r>
           </w:p>
         </w:tc>
@@ -21494,7 +21127,7 @@
         <w:br/>
         <w:t>• Custom transformer engineering samples on Ferroxcube PQ26/20 ferrite cores with triple-insulated Furukawa TEX-E wire required prior to Phase 3 schematic freeze.</w:t>
         <w:br/>
-        <w:t>• Component sourcing and lead times for TI LM5176, UCC28740, INA240, INA226, AMC1311, and ST STM32G474.</w:t>
+        <w:t>• Component sourcing and lead times for TI LM5176, UCC28740, INA226, AMC1311, and ST STM32G474.</w:t>
         <w:br/>
         <w:t>• Laboratory equipment availability: Chroma AC source, DC electronic load, 3000V RMS Hi-Pot tester, and thermal camera.</w:t>
         <w:br/>
@@ -21569,7 +21202,7 @@
         <w:br/>
         <w:t>Phase 3 — Schematic Design and Review:</w:t>
         <w:br/>
-        <w:t>Complete 4-stage Altium schematics capture; autonomous analog protection design; peer review gates with BU SME.</w:t>
+        <w:t>Complete 4-stage Altium schematics capture; LM5176 cycle-by-cycle current limit sensing and MCU enable control; peer review gates with BU SME.</w:t>
         <w:br/>
         <w:br/>
         <w:t>Phase 4 — PCB Layout &amp; DFM Review:</w:t>
@@ -22370,7 +22003,7 @@
     </w:p>
     <w:p>
       <w:r>
-        <w:t>The power supply hardware architecture consists of two galvanically isolated power conversion stages followed by synchronous post-regulation and autonomous analog hardware protection:</w:t>
+        <w:t>The power supply hardware architecture consists of two galvanically isolated power conversion stages followed by synchronous post-regulation and built-in controller hardware protection:</w:t>
       </w:r>
     </w:p>
     <w:p>
@@ -22810,7 +22443,7 @@
                 <w:color w:val="000000"/>
                 <w:sz w:val="17"/>
               </w:rPr>
-              <w:t>Sub-5µs Hardware Protection</w:t>
+              <w:t>Cycle-by-Cycle Current Limit</w:t>
             </w:r>
           </w:p>
         </w:tc>
@@ -22832,7 +22465,7 @@
                 <w:color w:val="000000"/>
                 <w:sz w:val="17"/>
               </w:rPr>
-              <w:t>10mΩ shunt, INA240A2 (50V/V), and TLV3501 (4.5ns comparator) pull COMP pin low in &lt; 5µs on overcurrent.</w:t>
+              <w:t>LM5176 senses current via 10mΩ shunt across CSP/CSN, natively clamping peak inductor current on every 300 kHz cycle.</w:t>
             </w:r>
           </w:p>
         </w:tc>
@@ -26166,7 +25799,7 @@
                 <w:color w:val="000000"/>
                 <w:sz w:val="17"/>
               </w:rPr>
-              <w:t>Precision Current Shunt Resistor 10mΩ 0.1% 3W 2512</w:t>
+              <w:t>Precision Current Shunt Resistor 10mΩ 0.1% 3W 2512 (CSP/CSN)</w:t>
             </w:r>
           </w:p>
         </w:tc>
@@ -26281,7 +25914,7 @@
                 <w:color w:val="000000"/>
                 <w:sz w:val="17"/>
               </w:rPr>
-              <w:t>Precision Current Sense Amplifier 50V/V SC70</w:t>
+              <w:t>Mixed-Signal MCU &amp; 12-Bit DAC Core LQFP-64</w:t>
             </w:r>
           </w:p>
         </w:tc>
@@ -26325,7 +25958,7 @@
                 <w:color w:val="000000"/>
                 <w:sz w:val="17"/>
               </w:rPr>
-              <w:t>Texas Instruments</w:t>
+              <w:t>STMicroelectronics</w:t>
             </w:r>
           </w:p>
         </w:tc>
@@ -26347,7 +25980,7 @@
                 <w:color w:val="000000"/>
                 <w:sz w:val="17"/>
               </w:rPr>
-              <w:t>INA240A2EDCKR</w:t>
+              <w:t>STM32G474RET6</w:t>
             </w:r>
           </w:p>
         </w:tc>
@@ -26396,7 +26029,7 @@
                 <w:color w:val="000000"/>
                 <w:sz w:val="17"/>
               </w:rPr>
-              <w:t>High-Speed Analog Comparator 4.5ns SOT-23-6</w:t>
+              <w:t>Isolated Delta-Sigma Modulator SOIC-8 (AC Sense)</w:t>
             </w:r>
           </w:p>
         </w:tc>
@@ -26462,7 +26095,7 @@
                 <w:color w:val="000000"/>
                 <w:sz w:val="17"/>
               </w:rPr>
-              <w:t>TLV3501AIDBVR</w:t>
+              <w:t>AMC1311DWVR</w:t>
             </w:r>
           </w:p>
         </w:tc>
@@ -26511,7 +26144,7 @@
                 <w:color w:val="000000"/>
                 <w:sz w:val="17"/>
               </w:rPr>
-              <w:t>Mixed-Signal MCU &amp; 12-Bit DAC Core LQFP-64</w:t>
+              <w:t>Toroidal Current Transformer 1000:1 (AC Current)</w:t>
             </w:r>
           </w:p>
         </w:tc>
@@ -26555,7 +26188,7 @@
                 <w:color w:val="000000"/>
                 <w:sz w:val="17"/>
               </w:rPr>
-              <w:t>STMicroelectronics</w:t>
+              <w:t>Talema</w:t>
             </w:r>
           </w:p>
         </w:tc>
@@ -26577,7 +26210,7 @@
                 <w:color w:val="000000"/>
                 <w:sz w:val="17"/>
               </w:rPr>
-              <w:t>STM32G474RET6</w:t>
+              <w:t>AC1005 (PCB Mount)</w:t>
             </w:r>
           </w:p>
         </w:tc>
@@ -26626,7 +26259,7 @@
                 <w:color w:val="000000"/>
                 <w:sz w:val="17"/>
               </w:rPr>
-              <w:t>Isolated Delta-Sigma Modulator SOIC-8 (AC Sense)</w:t>
+              <w:t>16-Bit I2C Power Monitor IC VSSOP-10 (DC Rail)</w:t>
             </w:r>
           </w:p>
         </w:tc>
@@ -26692,7 +26325,7 @@
                 <w:color w:val="000000"/>
                 <w:sz w:val="17"/>
               </w:rPr>
-              <w:t>AMC1311DWVR</w:t>
+              <w:t>INA226AIDGSR</w:t>
             </w:r>
           </w:p>
         </w:tc>
@@ -26741,7 +26374,7 @@
                 <w:color w:val="000000"/>
                 <w:sz w:val="17"/>
               </w:rPr>
-              <w:t>Toroidal Current Transformer 1000:1 (AC Current)</w:t>
+              <w:t>Heavy-Duty 4mm Gold-Plated Binding Posts (Red/Blk)</w:t>
             </w:r>
           </w:p>
         </w:tc>
@@ -26763,7 +26396,7 @@
                 <w:color w:val="000000"/>
                 <w:sz w:val="17"/>
               </w:rPr>
-              <w:t>1</w:t>
+              <w:t>2</w:t>
             </w:r>
           </w:p>
         </w:tc>
@@ -26785,7 +26418,7 @@
                 <w:color w:val="000000"/>
                 <w:sz w:val="17"/>
               </w:rPr>
-              <w:t>Talema</w:t>
+              <w:t>Pomona Electronics</w:t>
             </w:r>
           </w:p>
         </w:tc>
@@ -26807,7 +26440,7 @@
                 <w:color w:val="000000"/>
                 <w:sz w:val="17"/>
               </w:rPr>
-              <w:t>AC1005 (PCB Mount)</w:t>
+              <w:t>3770-0 / 3770-2</w:t>
             </w:r>
           </w:p>
         </w:tc>
@@ -26835,236 +26468,6 @@
                 <w:sz w:val="17"/>
               </w:rPr>
               <w:t>15</w:t>
-            </w:r>
-          </w:p>
-        </w:tc>
-        <w:tc>
-          <w:tcPr>
-            <w:tcW w:type="dxa" w:w="3412"/>
-            <w:vAlign w:val="center"/>
-          </w:tcPr>
-          <w:p>
-            <w:pPr>
-              <w:spacing w:before="40" w:after="40" w:line="252" w:lineRule="auto"/>
-              <w:jc w:val="left"/>
-            </w:pPr>
-            <w:r/>
-            <w:r>
-              <w:rPr>
-                <w:rFonts w:ascii="Arial" w:hAnsi="Arial"/>
-                <w:b w:val="0"/>
-                <w:color w:val="000000"/>
-                <w:sz w:val="17"/>
-              </w:rPr>
-              <w:t>16-Bit I2C Power Monitor IC VSSOP-10 (DC Rail)</w:t>
-            </w:r>
-          </w:p>
-        </w:tc>
-        <w:tc>
-          <w:tcPr>
-            <w:tcW w:type="dxa" w:w="648"/>
-            <w:vAlign w:val="center"/>
-          </w:tcPr>
-          <w:p>
-            <w:pPr>
-              <w:spacing w:before="40" w:after="40" w:line="252" w:lineRule="auto"/>
-              <w:jc w:val="center"/>
-            </w:pPr>
-            <w:r/>
-            <w:r>
-              <w:rPr>
-                <w:rFonts w:ascii="Arial" w:hAnsi="Arial"/>
-                <w:b w:val="0"/>
-                <w:color w:val="000000"/>
-                <w:sz w:val="17"/>
-              </w:rPr>
-              <w:t>1</w:t>
-            </w:r>
-          </w:p>
-        </w:tc>
-        <w:tc>
-          <w:tcPr>
-            <w:tcW w:type="dxa" w:w="1872"/>
-            <w:vAlign w:val="center"/>
-          </w:tcPr>
-          <w:p>
-            <w:pPr>
-              <w:spacing w:before="40" w:after="40" w:line="252" w:lineRule="auto"/>
-              <w:jc w:val="left"/>
-            </w:pPr>
-            <w:r/>
-            <w:r>
-              <w:rPr>
-                <w:rFonts w:ascii="Arial" w:hAnsi="Arial"/>
-                <w:b w:val="0"/>
-                <w:color w:val="000000"/>
-                <w:sz w:val="17"/>
-              </w:rPr>
-              <w:t>Texas Instruments</w:t>
-            </w:r>
-          </w:p>
-        </w:tc>
-        <w:tc>
-          <w:tcPr>
-            <w:tcW w:type="dxa" w:w="2592"/>
-            <w:vAlign w:val="center"/>
-          </w:tcPr>
-          <w:p>
-            <w:pPr>
-              <w:spacing w:before="40" w:after="40" w:line="252" w:lineRule="auto"/>
-              <w:jc w:val="left"/>
-            </w:pPr>
-            <w:r/>
-            <w:r>
-              <w:rPr>
-                <w:rFonts w:ascii="Arial" w:hAnsi="Arial"/>
-                <w:b w:val="0"/>
-                <w:color w:val="000000"/>
-                <w:sz w:val="17"/>
-              </w:rPr>
-              <w:t>INA226AIDGSR</w:t>
-            </w:r>
-          </w:p>
-        </w:tc>
-      </w:tr>
-      <w:tr>
-        <w:trPr>
-          <w:cantSplit/>
-        </w:trPr>
-        <w:tc>
-          <w:tcPr>
-            <w:tcW w:type="dxa" w:w="792"/>
-            <w:vAlign w:val="center"/>
-          </w:tcPr>
-          <w:p>
-            <w:pPr>
-              <w:spacing w:before="40" w:after="40" w:line="252" w:lineRule="auto"/>
-              <w:jc w:val="center"/>
-            </w:pPr>
-            <w:r/>
-            <w:r>
-              <w:rPr>
-                <w:rFonts w:ascii="Arial" w:hAnsi="Arial"/>
-                <w:b/>
-                <w:color w:val="000000"/>
-                <w:sz w:val="17"/>
-              </w:rPr>
-              <w:t>16</w:t>
-            </w:r>
-          </w:p>
-        </w:tc>
-        <w:tc>
-          <w:tcPr>
-            <w:tcW w:type="dxa" w:w="3412"/>
-            <w:vAlign w:val="center"/>
-          </w:tcPr>
-          <w:p>
-            <w:pPr>
-              <w:spacing w:before="40" w:after="40" w:line="252" w:lineRule="auto"/>
-              <w:jc w:val="left"/>
-            </w:pPr>
-            <w:r/>
-            <w:r>
-              <w:rPr>
-                <w:rFonts w:ascii="Arial" w:hAnsi="Arial"/>
-                <w:b w:val="0"/>
-                <w:color w:val="000000"/>
-                <w:sz w:val="17"/>
-              </w:rPr>
-              <w:t>Heavy-Duty 4mm Gold-Plated Binding Posts (Red/Blk)</w:t>
-            </w:r>
-          </w:p>
-        </w:tc>
-        <w:tc>
-          <w:tcPr>
-            <w:tcW w:type="dxa" w:w="648"/>
-            <w:vAlign w:val="center"/>
-          </w:tcPr>
-          <w:p>
-            <w:pPr>
-              <w:spacing w:before="40" w:after="40" w:line="252" w:lineRule="auto"/>
-              <w:jc w:val="center"/>
-            </w:pPr>
-            <w:r/>
-            <w:r>
-              <w:rPr>
-                <w:rFonts w:ascii="Arial" w:hAnsi="Arial"/>
-                <w:b w:val="0"/>
-                <w:color w:val="000000"/>
-                <w:sz w:val="17"/>
-              </w:rPr>
-              <w:t>2</w:t>
-            </w:r>
-          </w:p>
-        </w:tc>
-        <w:tc>
-          <w:tcPr>
-            <w:tcW w:type="dxa" w:w="1872"/>
-            <w:vAlign w:val="center"/>
-          </w:tcPr>
-          <w:p>
-            <w:pPr>
-              <w:spacing w:before="40" w:after="40" w:line="252" w:lineRule="auto"/>
-              <w:jc w:val="left"/>
-            </w:pPr>
-            <w:r/>
-            <w:r>
-              <w:rPr>
-                <w:rFonts w:ascii="Arial" w:hAnsi="Arial"/>
-                <w:b w:val="0"/>
-                <w:color w:val="000000"/>
-                <w:sz w:val="17"/>
-              </w:rPr>
-              <w:t>Pomona Electronics</w:t>
-            </w:r>
-          </w:p>
-        </w:tc>
-        <w:tc>
-          <w:tcPr>
-            <w:tcW w:type="dxa" w:w="2592"/>
-            <w:vAlign w:val="center"/>
-          </w:tcPr>
-          <w:p>
-            <w:pPr>
-              <w:spacing w:before="40" w:after="40" w:line="252" w:lineRule="auto"/>
-              <w:jc w:val="left"/>
-            </w:pPr>
-            <w:r/>
-            <w:r>
-              <w:rPr>
-                <w:rFonts w:ascii="Arial" w:hAnsi="Arial"/>
-                <w:b w:val="0"/>
-                <w:color w:val="000000"/>
-                <w:sz w:val="17"/>
-              </w:rPr>
-              <w:t>3770-0 / 3770-2</w:t>
-            </w:r>
-          </w:p>
-        </w:tc>
-      </w:tr>
-      <w:tr>
-        <w:trPr>
-          <w:cantSplit/>
-        </w:trPr>
-        <w:tc>
-          <w:tcPr>
-            <w:tcW w:type="dxa" w:w="792"/>
-            <w:vAlign w:val="center"/>
-          </w:tcPr>
-          <w:p>
-            <w:pPr>
-              <w:spacing w:before="40" w:after="40" w:line="252" w:lineRule="auto"/>
-              <w:jc w:val="center"/>
-            </w:pPr>
-            <w:r/>
-            <w:r>
-              <w:rPr>
-                <w:rFonts w:ascii="Arial" w:hAnsi="Arial"/>
-                <w:b/>
-                <w:color w:val="000000"/>
-                <w:sz w:val="17"/>
-              </w:rPr>
-              <w:t>17</w:t>
             </w:r>
           </w:p>
         </w:tc>
@@ -27219,7 +26622,7 @@
         </w:numPr>
       </w:pPr>
       <w:r>
-        <w:t>Three-phase 400V/480V AC industrial grid input operation (module is single-phase 85V–265V AC RMS only).</w:t>
+        <w:t>Complex External Protection Circuits — dedicated analog crowbar thyristors and discrete fast comparator pull-down networks are excluded in favor of built-in controller protection and MCU supervisory shutdown.</w:t>
       </w:r>
     </w:p>
     <w:p>
@@ -27231,7 +26634,7 @@
         </w:numPr>
       </w:pPr>
       <w:r>
-        <w:t>Negative/bipolar voltage rails (system provides positive 5.0V to 20.0V DC only). Wireless connectivity (Wi-Fi, BLE) and cloud IoT interfaces are excluded.</w:t>
+        <w:t>Three-phase 400V/480V AC industrial grid input operation (module is single-phase 85V–265V AC RMS only). Negative/bipolar rails and wireless IoT interfaces are excluded.</w:t>
       </w:r>
     </w:p>
     <w:p>
@@ -27407,12 +26810,12 @@
         <w:pStyle w:val="Heading3"/>
       </w:pPr>
       <w:r>
-        <w:t>Q7: Explain how the hardware protects against a short circuit in under 5 microseconds.</w:t>
+        <w:t>Q7: How does the power supply protect against overcurrent and short circuits?</w:t>
       </w:r>
     </w:p>
     <w:p>
       <w:r>
-        <w:t>Software is too slow to protect switching MOSFETs during a dead short. We implemented an autonomous analog hardware clamp: a 10mΩ metal shunt resistor feeds an INA240A2 current sense amplifier (gain = 50V/V). The amplified current signal feeds an ultra-fast TLV3501 analog comparator with 4.5ns response time. If load current exceeds the threshold (e.g. 3.2A), the comparator output immediately drives an NPN transistor that pulls down the LM5176's COMP pin to ground. This forces the PWM duty cycle to zero in under 5 microseconds, safely clamping the current before any software can even register an interrupt.</w:t>
+        <w:t>We use standard, proven industry protections built directly into the hardware controllers: 1) LM5176 Built-in Cycle-by-Cycle Current Limiting: The LM5176 continuously monitors inductor/output current through a 10mΩ precision sense resistor connected to its dedicated CSP and CSN pins. If current exceeds the programmed threshold, the controller immediately truncates the current PWM pulse, capping peak current on every 300 kHz switching cycle. 2) MCU Supervisory Disable: The MCU continuously reads output current via the INA226 power monitor over I2C. If a sustained overload or short-circuit is detected, the MCU pulls the LM5176 ENABLE pin low to safely disable power delivery. 3) Primary AC Fuse: A 2.0A ceramic time-lag fuse on the AC mains provides fail-safe isolation against internal catastrophic short circuits.</w:t>
       </w:r>
     </w:p>
     <w:p>

</xml_diff>

<commit_message>
chore(spps): remove obsolete and irrelevant block diagrams, update active diagrams to simplified design
</commit_message>
<xml_diff>
--- a/smart_programmable_power_supply/PRODUCT_REQUIREMENT_DOCUMENT_PRD.docx
+++ b/smart_programmable_power_supply/PRODUCT_REQUIREMENT_DOCUMENT_PRD.docx
@@ -22021,7 +22021,7 @@
       <w:r>
         <w:drawing>
           <wp:inline xmlns:a="http://schemas.openxmlformats.org/drawingml/2006/main" xmlns:pic="http://schemas.openxmlformats.org/drawingml/2006/picture">
-            <wp:extent cx="5916168" cy="1555493"/>
+            <wp:extent cx="5916168" cy="1658598"/>
             <wp:docPr id="24" name="Picture 24"/>
             <wp:cNvGraphicFramePr>
               <a:graphicFrameLocks noChangeAspect="1"/>
@@ -22042,7 +22042,7 @@
                   <pic:spPr>
                     <a:xfrm>
                       <a:off x="0" y="0"/>
-                      <a:ext cx="5916168" cy="1555493"/>
+                      <a:ext cx="5916168" cy="1658598"/>
                     </a:xfrm>
                     <a:prstGeom prst="rect"/>
                   </pic:spPr>

</xml_diff>